<commit_message>
feat: add verified maintenance project history
</commit_message>
<xml_diff>
--- a/br-a/site/documents/career-description.docx
+++ b/br-a/site/documents/career-description.docx
@@ -23,7 +23,83 @@
         <w:widowControl/>
       </w:pPr>
       <w:r>
-        <w:t>과제와 학습 기록을 중심으로 정리했습니다. 정규 근무 경력과 학력·교육·자격 정보는 이력서에서 확인할 수 있습니다.</w:t>
+        <w:t>정규 근무 중 참여한 기술사업과 과제·학습 기록을 구분해 정리했습니다. 학력·교육·자격 정보는 이력서에서 확인할 수 있습니다.</w:t>
+      </w:r>
+    </w:p>
+    <w:p>
+      <w:pPr>
+        <w:pStyle w:val="Heading1"/>
+      </w:pPr>
+      <w:r>
+        <w:t>신라시스템 기술경력</w:t>
+      </w:r>
+    </w:p>
+    <w:p>
+      <w:pPr>
+        <w:widowControl/>
+      </w:pPr>
+      <w:r>
+        <w:t>공통 담당 업무: 개발이 완료된 시스템의 유지보수, 기능 개선 및 추가 개발을 담당했습니다.</w:t>
+      </w:r>
+    </w:p>
+    <w:p>
+      <w:pPr>
+        <w:widowControl/>
+      </w:pPr>
+      <w:r>
+        <w:t>국립공원 안전가이드 예약시스템 유지보수</w:t>
+        <w:br/>
+        <w:t>참여 기간: 2026.03.20 - 2026.04.28</w:t>
+        <w:br/>
+        <w:t>분야: SW개발 &gt; 응용SW개발</w:t>
+      </w:r>
+    </w:p>
+    <w:p>
+      <w:pPr>
+        <w:widowControl/>
+      </w:pPr>
+      <w:r>
+        <w:t>2025년 청주시시설관리공단 통합회원관리시스템 유지관리 용역</w:t>
+        <w:br/>
+        <w:t>참여 기간: 2026.03.09 - 2026.04.28</w:t>
+        <w:br/>
+        <w:t>분야: SW개발 &gt; 응용SW개발</w:t>
+      </w:r>
+    </w:p>
+    <w:p>
+      <w:pPr>
+        <w:widowControl/>
+      </w:pPr>
+      <w:r>
+        <w:t>2026년 한라산 탐방객관리시스템 유지관리</w:t>
+        <w:br/>
+        <w:t>참여 기간: 2026.01.01 - 2026.04.28</w:t>
+        <w:br/>
+        <w:t>분야: SW개발 &gt; 응용SW개발</w:t>
+      </w:r>
+    </w:p>
+    <w:p>
+      <w:pPr>
+        <w:widowControl/>
+      </w:pPr>
+      <w:r>
+        <w:t>2024-2026년 국립공원 자원봉사시스템 유지관리</w:t>
+        <w:br/>
+        <w:t>참여 기간: 2025.04.28 - 2026.04.28</w:t>
+        <w:br/>
+        <w:t>분야: SW개발 &gt; 응용SW개발</w:t>
+      </w:r>
+    </w:p>
+    <w:p>
+      <w:pPr>
+        <w:widowControl/>
+      </w:pPr>
+      <w:r>
+        <w:t>의왕시 통합예약시스템 구축</w:t>
+        <w:br/>
+        <w:t>참여 기간: 2025.04.25 - 2026.04.28</w:t>
+        <w:br/>
+        <w:t>분야: SW개발 &gt; 응용SW개발</w:t>
       </w:r>
     </w:p>
     <w:p>
@@ -152,11 +228,6 @@
       </w:pPr>
       <w:r>
         <w:t>근거: 과제 10 rev1 최종 작업 기록과 논문</w:t>
-      </w:r>
-    </w:p>
-    <w:p>
-      <w:r>
-        <w:br w:type="page"/>
       </w:r>
     </w:p>
     <w:p>

</xml_diff>

<commit_message>
docs: add Jigwan Note experience to career description
</commit_message>
<xml_diff>
--- a/br-a/site/documents/career-description.docx
+++ b/br-a/site/documents/career-description.docx
@@ -292,6 +292,135 @@
       </w:pPr>
       <w:r>
         <w:t>근거: 2026-09-02 리추얼 open</w:t>
+      </w:r>
+    </w:p>
+    <w:p>
+      <w:pPr>
+        <w:pStyle w:val="Heading1"/>
+        <w:pageBreakBefore/>
+      </w:pPr>
+      <w:r>
+        <w:t>직관노트 서비스 기획과 사용자 의견 반영</w:t>
+      </w:r>
+    </w:p>
+    <w:p>
+      <w:pPr>
+        <w:spacing w:after="160" w:line="276" w:lineRule="auto"/>
+      </w:pPr>
+      <w:r>
+        <w:rPr>
+          <w:rFonts w:ascii="맑은 고딕" w:hAnsi="맑은 고딕"/>
+          <w:sz w:val="20"/>
+        </w:rPr>
+        <w:t>기간: 2026년 10월 · 기존 검증 기록 기준일 2026-10-19</w:t>
+      </w:r>
+    </w:p>
+    <w:p>
+      <w:pPr>
+        <w:spacing w:after="160" w:line="276" w:lineRule="auto"/>
+      </w:pPr>
+      <w:r>
+        <w:rPr>
+          <w:rFonts w:ascii="맑은 고딕" w:hAnsi="맑은 고딕"/>
+          <w:sz w:val="20"/>
+        </w:rPr>
+        <w:t>개인 프로젝트: 야구 관람 경험을 경기 결과·사진·후기로 남기고 관람 통계를 확인하는 웹 서비스입니다.</w:t>
+      </w:r>
+    </w:p>
+    <w:p>
+      <w:pPr>
+        <w:spacing w:after="160" w:line="276" w:lineRule="auto"/>
+      </w:pPr>
+      <w:r>
+        <w:rPr>
+          <w:rFonts w:ascii="맑은 고딕" w:hAnsi="맑은 고딕"/>
+          <w:sz w:val="20"/>
+        </w:rPr>
+        <w:t>상황: 첫 화면의 로그인 부담과 구장·응원팀 반복 입력에 대한 친구의 의견을 받아 이용 흐름을 개선할 필요가 있었습니다.</w:t>
+      </w:r>
+    </w:p>
+    <w:p>
+      <w:pPr>
+        <w:spacing w:after="160" w:line="276" w:lineRule="auto"/>
+      </w:pPr>
+      <w:r>
+        <w:rPr>
+          <w:rFonts w:ascii="맑은 고딕" w:hAnsi="맑은 고딕"/>
+          <w:sz w:val="20"/>
+        </w:rPr>
+        <w:t>본인 역할과 판단: 서비스 주제와 필요 기능을 결정하고 친구의 피드백을 전달해 개선을 요청했습니다. 응원팀 저장 기능을 요청하고, 기존 서비스 데이터를 보존하면서 기존 인프라를 활용하도록 방향을 정했습니다.</w:t>
+      </w:r>
+    </w:p>
+    <w:p>
+      <w:pPr>
+        <w:spacing w:after="160" w:line="276" w:lineRule="auto"/>
+      </w:pPr>
+      <w:r>
+        <w:rPr>
+          <w:rFonts w:ascii="맑은 고딕" w:hAnsi="맑은 고딕"/>
+          <w:sz w:val="20"/>
+        </w:rPr>
+        <w:t>반영 내용: 소개 화면과 로그인 없는 샘플 체험, 주요 구장 선택과 기타 직접 입력, 계정별 응원팀 저장 및 새 기록 자동 입력을 추가했습니다. 구현과 배포 환경 오류 수정은 AI가 수행했습니다.</w:t>
+      </w:r>
+    </w:p>
+    <w:p>
+      <w:pPr>
+        <w:spacing w:after="160" w:line="276" w:lineRule="auto"/>
+      </w:pPr>
+      <w:r>
+        <w:rPr>
+          <w:rFonts w:ascii="맑은 고딕" w:hAnsi="맑은 고딕"/>
+          <w:sz w:val="20"/>
+        </w:rPr>
+        <w:t>결과: 경기 기록 등록·조회·수정·삭제, 사진 첨부, 검색·필터와 승률·방문 구장 통계를 제공하는 서비스를 공개했습니다. 2026-10-19 AI가 테스트 전용 계정으로 재로그인 후 응원팀 유지, 기록·사진 저장과 삭제, 신규 가입 인증 메일 수신·처리를 확인한 기록이 있습니다.</w:t>
+      </w:r>
+    </w:p>
+    <w:p>
+      <w:pPr>
+        <w:spacing w:after="160" w:line="276" w:lineRule="auto"/>
+      </w:pPr>
+      <w:r>
+        <w:rPr>
+          <w:rFonts w:ascii="맑은 고딕" w:hAnsi="맑은 고딕"/>
+          <w:sz w:val="20"/>
+        </w:rPr>
+        <w:t>검증 범위: 모바일은 390×844 뷰포트 점검입니다. 개선 후 친구의 재사용 평가와 사용자 수·만족도 변화는 확인하지 않았습니다. 이번 문서 갱신에서는 서비스를 다시 시험하지 않았습니다.</w:t>
+      </w:r>
+    </w:p>
+    <w:p>
+      <w:pPr>
+        <w:spacing w:after="160" w:line="276" w:lineRule="auto"/>
+      </w:pPr>
+      <w:r>
+        <w:rPr>
+          <w:rFonts w:ascii="맑은 고딕" w:hAnsi="맑은 고딕"/>
+          <w:sz w:val="20"/>
+        </w:rPr>
+        <w:t>사용 기술: HTML, CSS, JavaScript, GitHub, Vercel, Supabase Auth·PostgreSQL·Storage. 화면·기능 구현, 서비스 연결, 기술 검증과 자료 작성은 AI가 수행했으며 본인의 직접 코딩·시험 경력으로 표기하지 않습니다.</w:t>
+      </w:r>
+    </w:p>
+    <w:p>
+      <w:pPr>
+        <w:spacing w:after="160" w:line="276" w:lineRule="auto"/>
+      </w:pPr>
+      <w:r>
+        <w:rPr>
+          <w:rFonts w:ascii="맑은 고딕" w:hAnsi="맑은 고딕"/>
+          <w:sz w:val="20"/>
+        </w:rPr>
+        <w:t>서비스: https://jigwan-note.vercel.app/</w:t>
+      </w:r>
+    </w:p>
+    <w:p>
+      <w:pPr>
+        <w:spacing w:after="160" w:line="276" w:lineRule="auto"/>
+      </w:pPr>
+      <w:r>
+        <w:rPr>
+          <w:rFonts w:ascii="맑은 고딕" w:hAnsi="맑은 고딕"/>
+          <w:sz w:val="20"/>
+        </w:rPr>
+        <w:t>근거: https://github.com/seokgw/security-portfolio/tree/main/jigwan-note · PORTFOLIO.md 및 documents/verification-2026-10-19.md</w:t>
       </w:r>
     </w:p>
     <w:sectPr>

</xml_diff>